<commit_message>
Add natural experiments subsidiary analysis (Appendix C) and remove Lancet documents
- Add natural_experiments.py: analysis of countries with major political/border changes
  (Germany reunification, Czechoslovakia split, Yugoslavia breakup, Baltic states, Ethiopia/Eritrea)
- Add Appendix C to EN and JP manuscripts with Tables C1/C2 and Figures 6-7
- Remove all Lancet-related scripts and documents (rejected)
- Remove Lancet disclosure from PDR cover letter
- Update cover letter to reflect new appendix count (3 appendices, 7 figures, 3 tables)
- Generate new figures: fig_germany_reunification.png, fig_natural_experiments_summary.png

Co-Authored-By: Tatsuki Onishi <bougtoir@gmail.com>
</commit_message>
<xml_diff>
--- a/tempo-effect-paper/manuscripts/CoverLetter_PDR_EN.docx
+++ b/tempo-effect-paper/manuscripts/CoverLetter_PDR_EN.docx
@@ -13,7 +13,7 @@
           <w:i w:val="0"/>
           <w:sz w:val="24"/>
         </w:rPr>
-        <w:t>March 31, 2026</w:t>
+        <w:t>April 14, 2026</w:t>
       </w:r>
     </w:p>
     <w:p>
@@ -108,20 +108,7 @@
           <w:i w:val="0"/>
           <w:sz w:val="24"/>
         </w:rPr>
-        <w:t>The manuscript is approximately 5,500 words with 5 figures, 1 table, and 2 appendices (including a comparative table of national population projection methodologies for 15 countries/agencies). It follows GATHER reporting guidelines. The manuscript is formatted for double-anonymised review; author-identifying information appears only in this cover letter.</w:t>
-      </w:r>
-    </w:p>
-    <w:p>
-      <w:pPr>
-        <w:spacing w:after="160"/>
-      </w:pPr>
-      <w:r>
-        <w:rPr>
-          <w:b w:val="0"/>
-          <w:i w:val="0"/>
-          <w:sz w:val="24"/>
-        </w:rPr>
-        <w:t>Disclosure: A preliminary summary of these findings (~300 words) has been submitted to The Lancet as a Correspondence. That short communication presents the core result without the full model specification, 40-country validation, bias analysis, or policy framework developed here. We disclose this in the interest of transparency and believe the two publications are complementary rather than overlapping.</w:t>
+        <w:t>The manuscript is approximately 6,500 words with 7 figures, 3 tables, and 3 appendices (including a comparative table of national population projection methodologies for 15 countries/agencies, and a natural experiments analysis examining countries with major political/border changes as exogenous shocks). It follows GATHER reporting guidelines. The manuscript is formatted for double-anonymised review; author-identifying information appears only in this cover letter.</w:t>
       </w:r>
     </w:p>
     <w:p>

</xml_diff>